<commit_message>
PiRBiHD prak 1 2
</commit_message>
<xml_diff>
--- a/2_sem/PiRBiHD/prak1/ИКМО_03_25_ФомичевРА_Практическая1.docx
+++ b/2_sem/PiRBiHD/prak1/ИКМО_03_25_ФомичевРА_Практическая1.docx
@@ -53,7 +53,7 @@
                 <w:lang w:eastAsia="ru-RU"/>
               </w:rPr>
               <w:drawing>
-                <wp:inline distT="0" distB="0" distL="0" distR="0" wp14:anchorId="2BE2D30D" wp14:editId="6C54C76C">
+                <wp:inline distT="0" distB="0" distL="0" distR="0" wp14:anchorId="2BE2D30D" wp14:editId="1C81721C">
                   <wp:extent cx="1066800" cy="1066800"/>
                   <wp:effectExtent l="0" t="0" r="0" b="0"/>
                   <wp:docPr id="298370851" name="Рисунок 3"/>
@@ -1635,6 +1635,9 @@
         <w:jc w:val="center"/>
       </w:pPr>
       <w:r>
+        <w:rPr>
+          <w:noProof/>
+        </w:rPr>
         <w:drawing>
           <wp:inline distT="0" distB="0" distL="0" distR="0" wp14:anchorId="4A102913" wp14:editId="49AA16B5">
             <wp:extent cx="5585460" cy="2501933"/>
@@ -1681,18 +1684,10 @@
       </w:r>
     </w:p>
     <w:p>
-      <w:pPr>
-        <w:rPr>
-          <w:lang w:val="en-US"/>
-        </w:rPr>
-      </w:pPr>
       <w:r>
         <w:t>Датасет имеет следующие столбцы</w:t>
       </w:r>
       <w:r>
-        <w:rPr>
-          <w:lang w:val="en-US"/>
-        </w:rPr>
         <w:t>:</w:t>
       </w:r>
     </w:p>
@@ -1706,16 +1701,25 @@
         <w:ind w:left="0" w:firstLine="709"/>
       </w:pPr>
       <w:r>
-        <w:t>Возраст – число</w:t>
-      </w:r>
-      <w:r>
-        <w:rPr>
-          <w:lang w:val="en-US"/>
-        </w:rPr>
+        <w:t>Возраст</w:t>
+      </w:r>
+      <w:r>
+        <w:t xml:space="preserve"> </w:t>
+      </w:r>
+      <w:r>
+        <w:t>(Age)</w:t>
+      </w:r>
+      <w:r>
+        <w:t xml:space="preserve"> – число</w:t>
+      </w:r>
+      <w:r>
         <w:t xml:space="preserve">: </w:t>
       </w:r>
       <w:r>
         <w:t>возраст покупателя</w:t>
+      </w:r>
+      <w:r>
+        <w:t>.</w:t>
       </w:r>
     </w:p>
     <w:p>
@@ -1728,16 +1732,25 @@
         <w:ind w:left="0" w:firstLine="709"/>
       </w:pPr>
       <w:r>
-        <w:t>Пол – строка</w:t>
-      </w:r>
-      <w:r>
-        <w:rPr>
-          <w:lang w:val="en-US"/>
-        </w:rPr>
+        <w:t xml:space="preserve">Пол </w:t>
+      </w:r>
+      <w:r>
+        <w:t>(Gender)</w:t>
+      </w:r>
+      <w:r>
+        <w:t xml:space="preserve"> </w:t>
+      </w:r>
+      <w:r>
+        <w:t>– строка</w:t>
+      </w:r>
+      <w:r>
         <w:t xml:space="preserve">: </w:t>
       </w:r>
       <w:r>
         <w:t>пол покупателя</w:t>
+      </w:r>
+      <w:r>
+        <w:t>.</w:t>
       </w:r>
     </w:p>
     <w:p>
@@ -1753,6 +1766,12 @@
         <w:t xml:space="preserve">Название </w:t>
       </w:r>
       <w:r>
+        <w:t>(Item Purchased)</w:t>
+      </w:r>
+      <w:r>
+        <w:t xml:space="preserve"> </w:t>
+      </w:r>
+      <w:r>
         <w:t>– строка</w:t>
       </w:r>
       <w:r>
@@ -1760,6 +1779,9 @@
       </w:r>
       <w:r>
         <w:t>одежда, купленная пользователем</w:t>
+      </w:r>
+      <w:r>
+        <w:t>.</w:t>
       </w:r>
     </w:p>
     <w:p>
@@ -1772,7 +1794,19 @@
         <w:ind w:left="0" w:firstLine="709"/>
       </w:pPr>
       <w:r>
-        <w:t>Категория – строка: категория одежды</w:t>
+        <w:t>Категория</w:t>
+      </w:r>
+      <w:r>
+        <w:t xml:space="preserve"> </w:t>
+      </w:r>
+      <w:r>
+        <w:t>(Category)</w:t>
+      </w:r>
+      <w:r>
+        <w:t xml:space="preserve"> – строка: категория одежды</w:t>
+      </w:r>
+      <w:r>
+        <w:t>.</w:t>
       </w:r>
     </w:p>
     <w:p>
@@ -1785,7 +1819,19 @@
         <w:ind w:left="0" w:firstLine="709"/>
       </w:pPr>
       <w:r>
-        <w:t>Стоимость – число: стоимость покупки в долларах</w:t>
+        <w:t>Стоимость</w:t>
+      </w:r>
+      <w:r>
+        <w:t xml:space="preserve"> </w:t>
+      </w:r>
+      <w:r>
+        <w:t>(Purchase Amount (USD))</w:t>
+      </w:r>
+      <w:r>
+        <w:t xml:space="preserve"> – число: стоимость покупки в долларах</w:t>
+      </w:r>
+      <w:r>
+        <w:t>.</w:t>
       </w:r>
     </w:p>
     <w:p>
@@ -1798,10 +1844,22 @@
         <w:ind w:left="0" w:firstLine="709"/>
       </w:pPr>
       <w:r>
-        <w:t>Локация – строка: штат</w:t>
+        <w:t>Локация</w:t>
+      </w:r>
+      <w:r>
+        <w:t xml:space="preserve"> </w:t>
+      </w:r>
+      <w:r>
+        <w:t>(Location)</w:t>
+      </w:r>
+      <w:r>
+        <w:t xml:space="preserve"> – строка: штат</w:t>
       </w:r>
       <w:r>
         <w:t xml:space="preserve"> покупки</w:t>
+      </w:r>
+      <w:r>
+        <w:t>.</w:t>
       </w:r>
     </w:p>
     <w:p>
@@ -1814,7 +1872,19 @@
         <w:ind w:left="0" w:firstLine="709"/>
       </w:pPr>
       <w:r>
-        <w:t>Размер – строка: размер одежды</w:t>
+        <w:t>Размер</w:t>
+      </w:r>
+      <w:r>
+        <w:t xml:space="preserve"> </w:t>
+      </w:r>
+      <w:r>
+        <w:t>(Size)</w:t>
+      </w:r>
+      <w:r>
+        <w:t xml:space="preserve"> – строка: размер одежды</w:t>
+      </w:r>
+      <w:r>
+        <w:t>.</w:t>
       </w:r>
     </w:p>
     <w:p>
@@ -1827,7 +1897,16 @@
         <w:ind w:left="0" w:firstLine="709"/>
       </w:pPr>
       <w:r>
-        <w:t xml:space="preserve">Цвет </w:t>
+        <w:t>Цвет</w:t>
+      </w:r>
+      <w:r>
+        <w:t xml:space="preserve"> </w:t>
+      </w:r>
+      <w:r>
+        <w:t>(Color)</w:t>
+      </w:r>
+      <w:r>
+        <w:t xml:space="preserve"> </w:t>
       </w:r>
       <w:r>
         <w:t>–</w:t>
@@ -1837,6 +1916,9 @@
       </w:r>
       <w:r>
         <w:t>строка: цвет одежды</w:t>
+      </w:r>
+      <w:r>
+        <w:t>.</w:t>
       </w:r>
     </w:p>
     <w:p>
@@ -1849,7 +1931,176 @@
         <w:ind w:left="0" w:firstLine="709"/>
       </w:pPr>
       <w:r>
-        <w:t>Сезон – строка: сезон одежды</w:t>
+        <w:t>Сезон</w:t>
+      </w:r>
+      <w:r>
+        <w:t xml:space="preserve"> </w:t>
+      </w:r>
+      <w:r>
+        <w:t>(Season)</w:t>
+      </w:r>
+      <w:r>
+        <w:t xml:space="preserve"> – строка: сезон одежды</w:t>
+      </w:r>
+      <w:r>
+        <w:t>.</w:t>
+      </w:r>
+    </w:p>
+    <w:p>
+      <w:pPr>
+        <w:pStyle w:val="a3"/>
+        <w:numPr>
+          <w:ilvl w:val="0"/>
+          <w:numId w:val="5"/>
+        </w:numPr>
+        <w:ind w:left="0" w:firstLine="709"/>
+      </w:pPr>
+      <w:r>
+        <w:t>Рейтинг (</w:t>
+      </w:r>
+      <w:r>
+        <w:t>Review Rating</w:t>
+      </w:r>
+      <w:r>
+        <w:t>)</w:t>
+      </w:r>
+      <w:r>
+        <w:t xml:space="preserve"> – число: рейтинг товара, поставленный покупателем</w:t>
+      </w:r>
+      <w:r>
+        <w:t>.</w:t>
+      </w:r>
+    </w:p>
+    <w:p>
+      <w:pPr>
+        <w:pStyle w:val="a3"/>
+        <w:numPr>
+          <w:ilvl w:val="0"/>
+          <w:numId w:val="5"/>
+        </w:numPr>
+        <w:ind w:left="0" w:firstLine="709"/>
+      </w:pPr>
+      <w:r>
+        <w:t>Подписка (</w:t>
+      </w:r>
+      <w:r>
+        <w:t>Subscription Status</w:t>
+      </w:r>
+      <w:r>
+        <w:t>)</w:t>
+      </w:r>
+      <w:r>
+        <w:t xml:space="preserve"> – строка</w:t>
+      </w:r>
+      <w:r>
+        <w:t>:</w:t>
+      </w:r>
+      <w:r>
+        <w:t xml:space="preserve"> наличие у покупателя подписки или членства в программе лояльности</w:t>
+      </w:r>
+      <w:r>
+        <w:t>.</w:t>
+      </w:r>
+    </w:p>
+    <w:p>
+      <w:pPr>
+        <w:pStyle w:val="a3"/>
+        <w:numPr>
+          <w:ilvl w:val="0"/>
+          <w:numId w:val="5"/>
+        </w:numPr>
+        <w:ind w:left="0" w:firstLine="709"/>
+      </w:pPr>
+      <w:r>
+        <w:t>Скидка (</w:t>
+      </w:r>
+      <w:r>
+        <w:t>Discount Applied</w:t>
+      </w:r>
+      <w:r>
+        <w:t>)</w:t>
+      </w:r>
+      <w:r>
+        <w:t xml:space="preserve"> – строка: была ли применена скидка к покупке.</w:t>
+      </w:r>
+    </w:p>
+    <w:p>
+      <w:pPr>
+        <w:pStyle w:val="a3"/>
+        <w:numPr>
+          <w:ilvl w:val="0"/>
+          <w:numId w:val="5"/>
+        </w:numPr>
+        <w:ind w:left="0" w:firstLine="709"/>
+      </w:pPr>
+      <w:r>
+        <w:lastRenderedPageBreak/>
+        <w:t>Покупки (</w:t>
+      </w:r>
+      <w:r>
+        <w:t>Previous Purchases</w:t>
+      </w:r>
+      <w:r>
+        <w:t>)</w:t>
+      </w:r>
+      <w:r>
+        <w:t xml:space="preserve"> – число: количество предыдущих покупок клиента</w:t>
+      </w:r>
+      <w:r>
+        <w:t>.</w:t>
+      </w:r>
+    </w:p>
+    <w:p>
+      <w:pPr>
+        <w:pStyle w:val="a3"/>
+        <w:numPr>
+          <w:ilvl w:val="0"/>
+          <w:numId w:val="5"/>
+        </w:numPr>
+        <w:ind w:left="0" w:firstLine="709"/>
+      </w:pPr>
+      <w:r>
+        <w:t>Оплата (</w:t>
+      </w:r>
+      <w:r>
+        <w:t>Payment Method</w:t>
+      </w:r>
+      <w:r>
+        <w:t>)</w:t>
+      </w:r>
+      <w:r>
+        <w:t xml:space="preserve"> – строка: способ оплаты</w:t>
+      </w:r>
+      <w:r>
+        <w:t>.</w:t>
+      </w:r>
+    </w:p>
+    <w:p>
+      <w:pPr>
+        <w:pStyle w:val="a3"/>
+        <w:numPr>
+          <w:ilvl w:val="0"/>
+          <w:numId w:val="5"/>
+        </w:numPr>
+        <w:ind w:left="0" w:firstLine="709"/>
+      </w:pPr>
+      <w:r>
+        <w:t>Частота покупок</w:t>
+      </w:r>
+      <w:r>
+        <w:t xml:space="preserve"> (</w:t>
+      </w:r>
+      <w:r>
+        <w:t>Frequency of Purchases</w:t>
+      </w:r>
+      <w:r>
+        <w:t>)</w:t>
+      </w:r>
+      <w:r>
+        <w:t xml:space="preserve"> – строка: частота совершения покупок</w:t>
+      </w:r>
+      <w:r>
+        <w:t>.</w:t>
       </w:r>
     </w:p>
     <w:p>
@@ -1868,6 +2119,9 @@
         <w:jc w:val="center"/>
       </w:pPr>
       <w:r>
+        <w:rPr>
+          <w:noProof/>
+        </w:rPr>
         <w:drawing>
           <wp:inline distT="0" distB="0" distL="0" distR="0" wp14:anchorId="790A5C0C" wp14:editId="561979D2">
             <wp:extent cx="5676900" cy="1602811"/>
@@ -1927,10 +2181,10 @@
       <w:r>
         <w:lastRenderedPageBreak/>
         <w:drawing>
-          <wp:inline distT="0" distB="0" distL="0" distR="0" wp14:anchorId="71CF3129" wp14:editId="349DF76B">
-            <wp:extent cx="2734057" cy="4467849"/>
-            <wp:effectExtent l="0" t="0" r="9525" b="9525"/>
-            <wp:docPr id="738468292" name="Рисунок 1"/>
+          <wp:inline distT="0" distB="0" distL="0" distR="0" wp14:anchorId="5B8AC450" wp14:editId="759A214D">
+            <wp:extent cx="2743583" cy="7106642"/>
+            <wp:effectExtent l="0" t="0" r="0" b="0"/>
+            <wp:docPr id="1805360302" name="Рисунок 1"/>
             <wp:cNvGraphicFramePr>
               <a:graphicFrameLocks xmlns:a="http://schemas.openxmlformats.org/drawingml/2006/main" noChangeAspect="1"/>
             </wp:cNvGraphicFramePr>
@@ -1938,7 +2192,7 @@
               <a:graphicData uri="http://schemas.openxmlformats.org/drawingml/2006/picture">
                 <pic:pic xmlns:pic="http://schemas.openxmlformats.org/drawingml/2006/picture">
                   <pic:nvPicPr>
-                    <pic:cNvPr id="738468292" name=""/>
+                    <pic:cNvPr id="1805360302" name=""/>
                     <pic:cNvPicPr/>
                   </pic:nvPicPr>
                   <pic:blipFill>
@@ -1950,7 +2204,7 @@
                   <pic:spPr>
                     <a:xfrm>
                       <a:off x="0" y="0"/>
-                      <a:ext cx="2734057" cy="4467849"/>
+                      <a:ext cx="2743583" cy="7106642"/>
                     </a:xfrm>
                     <a:prstGeom prst="rect">
                       <a:avLst/>
@@ -2961,7 +3215,6 @@
   <w:style w:type="character" w:default="1" w:styleId="a0">
     <w:name w:val="Default Paragraph Font"/>
     <w:uiPriority w:val="1"/>
-    <w:semiHidden/>
     <w:unhideWhenUsed/>
   </w:style>
   <w:style w:type="table" w:default="1" w:styleId="a1">

</xml_diff>